<commit_message>
Report: correct the TruckScenes LiDAR row and add the AD-3 industry section
Two edits to evidence/Report_Final_Final_v2.docx, matching its existing
formatting:

- "Why no radar-vs-LiDAR detector benchmark ran": the PointPillars row
  now gives the rectified result (mAP 0.0067 after rotating the tilted
  blind-spot LiDAR upright, 0.0000 unrotated; pending PR #63 review) and
  the 23.9% channel coverage. EXP-0024 and record 0029 added to the
  source line.
- New section "How our findings compare with industry (AD-3, Aiden)"
  after "What this adds up to": five findings against public company
  claims (3 agree, 2 tensions), sourced to docs/ad-3-industry-check.md.

Schema-validated; rendered through Word and checked visually.

Co-Authored-By: Claude Opus 5.5 <noreply@anthropic.com>
</commit_message>
<xml_diff>
--- a/evidence/Report_Final_Final_v2.docx
+++ b/evidence/Report_Final_Final_v2.docx
@@ -2716,7 +2716,7 @@
                 <w:sz w:val="18"/>
                 <w:szCs w:val="18"/>
               </w:rPr>
-              <w:t xml:space="preserve">PointPillars LiDAR on TruckScenes (PR #63)</w:t>
+              <w:t xml:space="preserve">PointPillars LiDAR on TruckScenes (EXP-0024)</w:t>
             </w:r>
           </w:p>
         </w:tc>
@@ -2744,7 +2744,7 @@
                 <w:sz w:val="18"/>
                 <w:szCs w:val="18"/>
               </w:rPr>
-              <w:t xml:space="preserve">Runs; score not valid yet</w:t>
+              <w:t xml:space="preserve">Near zero</w:t>
             </w:r>
           </w:p>
         </w:tc>
@@ -2772,7 +2772,7 @@
                 <w:sz w:val="18"/>
                 <w:szCs w:val="18"/>
               </w:rPr>
-              <w:t xml:space="preserve">The tilted roof LiDAR went into an upright-box model unrotated; fix pending</w:t>
+              <w:t xml:space="preserve">mAP 0.0067 after rotating the tilted blind-spot LiDAR upright (0.0000 unrotated; pending PR #63 review). One short-range channel: only 23.9% of scored boxes contain any of its points</w:t>
             </w:r>
           </w:p>
         </w:tc>
@@ -2892,6 +2892,28 @@
             <w:rStyle w:val="Hyperlink"/>
           </w:rPr>
           <w:t xml:space="preserve">ad-s3-1-detector-feasibility-summary.md</w:t>
+        </w:r>
+      </w:hyperlink>
+      <w:r>
+        <w:t xml:space="preserve"> · </w:t>
+      </w:r>
+      <w:hyperlink w:history="1" r:id="rIdAiden0024log">
+        <w:r>
+          <w:rPr>
+            <w:rStyle w:val="Hyperlink"/>
+          </w:rPr>
+          <w:t xml:space="preserve">EXP-0024</w:t>
+        </w:r>
+      </w:hyperlink>
+      <w:r>
+        <w:t xml:space="preserve"> · </w:t>
+      </w:r>
+      <w:hyperlink w:history="1" r:id="rIdAiden0029rec">
+        <w:r>
+          <w:rPr>
+            <w:rStyle w:val="Hyperlink"/>
+          </w:rPr>
+          <w:t xml:space="preserve">record 0029</w:t>
         </w:r>
       </w:hyperlink>
     </w:p>
@@ -3666,6 +3688,601 @@
             <w:rStyle w:val="Hyperlink"/>
           </w:rPr>
           <w:t xml:space="preserve">dataset-suitability.md §7</w:t>
+        </w:r>
+      </w:hyperlink>
+    </w:p>
+    <w:p>
+      <w:pPr>
+        <w:pStyle w:val="Heading1"/>
+      </w:pPr>
+      <w:r>
+        <w:t xml:space="preserve">How our findings compare with industry (AD-3, Aiden)</w:t>
+      </w:r>
+    </w:p>
+    <w:p>
+      <w:pPr>
+        <w:spacing w:after="120"/>
+      </w:pPr>
+      <w:r>
+        <w:t xml:space="preserve">We checked the team's main sensor findings against what leading autonomous trucking companies publish (Aurora, Kodiak, Torc, Plus, Waabi, Gatik). Companies publish claims, not scores on our datasets, so no numbers are compared directly.</w:t>
+      </w:r>
+    </w:p>
+    <w:tbl>
+      <w:tblPr>
+        <w:tblW w:type="dxa" w:w="9026"/>
+        <w:tblBorders>
+          <w:top w:val="single" w:color="auto" w:sz="4"/>
+          <w:left w:val="single" w:color="auto" w:sz="4"/>
+          <w:bottom w:val="single" w:color="auto" w:sz="4"/>
+          <w:right w:val="single" w:color="auto" w:sz="4"/>
+          <w:insideH w:val="single" w:color="auto" w:sz="4"/>
+          <w:insideV w:val="single" w:color="auto" w:sz="4"/>
+        </w:tblBorders>
+      </w:tblPr>
+      <w:tblGrid>
+        <w:gridCol w:w="3000"/>
+        <w:gridCol w:w="4426"/>
+        <w:gridCol w:w="1600"/>
+      </w:tblGrid>
+      <w:tr>
+        <w:trPr>
+          <w:tblHeader/>
+        </w:trPr>
+        <w:tc>
+          <w:tcPr>
+            <w:tcW w:type="dxa" w:w="3000"/>
+            <w:tcBorders>
+              <w:top w:val="single" w:color="BFBFBF" w:sz="4"/>
+              <w:left w:val="single" w:color="BFBFBF" w:sz="4"/>
+              <w:bottom w:val="single" w:color="BFBFBF" w:sz="4"/>
+              <w:right w:val="single" w:color="BFBFBF" w:sz="4"/>
+            </w:tcBorders>
+            <w:shd w:fill="E8EEF4" w:color="auto" w:val="clear"/>
+            <w:tcMar>
+              <w:top w:type="dxa" w:w="60"/>
+              <w:left w:type="dxa" w:w="100"/>
+              <w:bottom w:type="dxa" w:w="60"/>
+              <w:right w:type="dxa" w:w="100"/>
+            </w:tcMar>
+          </w:tcPr>
+          <w:p>
+            <w:r>
+              <w:rPr>
+                <w:b/>
+                <w:bCs/>
+                <w:sz w:val="18"/>
+                <w:szCs w:val="18"/>
+              </w:rPr>
+              <w:t xml:space="preserve">Our finding</w:t>
+            </w:r>
+          </w:p>
+        </w:tc>
+        <w:tc>
+          <w:tcPr>
+            <w:tcW w:type="dxa" w:w="4426"/>
+            <w:tcBorders>
+              <w:top w:val="single" w:color="BFBFBF" w:sz="4"/>
+              <w:left w:val="single" w:color="BFBFBF" w:sz="4"/>
+              <w:bottom w:val="single" w:color="BFBFBF" w:sz="4"/>
+              <w:right w:val="single" w:color="BFBFBF" w:sz="4"/>
+            </w:tcBorders>
+            <w:shd w:fill="E8EEF4" w:color="auto" w:val="clear"/>
+            <w:tcMar>
+              <w:top w:type="dxa" w:w="60"/>
+              <w:left w:type="dxa" w:w="100"/>
+              <w:bottom w:type="dxa" w:w="60"/>
+              <w:right w:type="dxa" w:w="100"/>
+            </w:tcMar>
+          </w:tcPr>
+          <w:p>
+            <w:r>
+              <w:rPr>
+                <w:b/>
+                <w:bCs/>
+                <w:sz w:val="18"/>
+                <w:szCs w:val="18"/>
+              </w:rPr>
+              <w:t xml:space="preserve">What industry says</w:t>
+            </w:r>
+          </w:p>
+        </w:tc>
+        <w:tc>
+          <w:tcPr>
+            <w:tcW w:type="dxa" w:w="1600"/>
+            <w:tcBorders>
+              <w:top w:val="single" w:color="BFBFBF" w:sz="4"/>
+              <w:left w:val="single" w:color="BFBFBF" w:sz="4"/>
+              <w:bottom w:val="single" w:color="BFBFBF" w:sz="4"/>
+              <w:right w:val="single" w:color="BFBFBF" w:sz="4"/>
+            </w:tcBorders>
+            <w:shd w:fill="E8EEF4" w:color="auto" w:val="clear"/>
+            <w:tcMar>
+              <w:top w:type="dxa" w:w="60"/>
+              <w:left w:type="dxa" w:w="100"/>
+              <w:bottom w:type="dxa" w:w="60"/>
+              <w:right w:type="dxa" w:w="100"/>
+            </w:tcMar>
+          </w:tcPr>
+          <w:p>
+            <w:r>
+              <w:rPr>
+                <w:b/>
+                <w:bCs/>
+                <w:sz w:val="18"/>
+                <w:szCs w:val="18"/>
+              </w:rPr>
+              <w:t xml:space="preserve">Verdict</w:t>
+            </w:r>
+          </w:p>
+        </w:tc>
+      </w:tr>
+      <w:tr>
+        <w:tc>
+          <w:tcPr>
+            <w:tcW w:type="dxa" w:w="3000"/>
+            <w:tcBorders>
+              <w:top w:val="single" w:color="BFBFBF" w:sz="4"/>
+              <w:left w:val="single" w:color="BFBFBF" w:sz="4"/>
+              <w:bottom w:val="single" w:color="BFBFBF" w:sz="4"/>
+              <w:right w:val="single" w:color="BFBFBF" w:sz="4"/>
+            </w:tcBorders>
+            <w:tcMar>
+              <w:top w:type="dxa" w:w="60"/>
+              <w:left w:type="dxa" w:w="100"/>
+              <w:bottom w:type="dxa" w:w="60"/>
+              <w:right w:type="dxa" w:w="100"/>
+            </w:tcMar>
+          </w:tcPr>
+          <w:p>
+            <w:r>
+              <w:rPr>
+                <w:b w:val="false"/>
+                <w:bCs w:val="false"/>
+                <w:sz w:val="18"/>
+                <w:szCs w:val="18"/>
+              </w:rPr>
+              <w:t xml:space="preserve">LiDAR keeps more evidence on distant vehicles than radar (TruckDrive, 80.36% vs 37.50% at 200–400 m)</w:t>
+            </w:r>
+          </w:p>
+        </w:tc>
+        <w:tc>
+          <w:tcPr>
+            <w:tcW w:type="dxa" w:w="4426"/>
+            <w:tcBorders>
+              <w:top w:val="single" w:color="BFBFBF" w:sz="4"/>
+              <w:left w:val="single" w:color="BFBFBF" w:sz="4"/>
+              <w:bottom w:val="single" w:color="BFBFBF" w:sz="4"/>
+              <w:right w:val="single" w:color="BFBFBF" w:sz="4"/>
+            </w:tcBorders>
+            <w:tcMar>
+              <w:top w:type="dxa" w:w="60"/>
+              <w:left w:type="dxa" w:w="100"/>
+              <w:bottom w:type="dxa" w:w="60"/>
+              <w:right w:type="dxa" w:w="100"/>
+            </w:tcMar>
+          </w:tcPr>
+          <w:p>
+            <w:r>
+              <w:rPr>
+                <w:b w:val="false"/>
+                <w:bCs w:val="false"/>
+                <w:sz w:val="18"/>
+                <w:szCs w:val="18"/>
+              </w:rPr>
+              <w:t xml:space="preserve">Long-range perception relies on long-range LiDAR (Aurora 450 m+, Torc/Aeva 500 m); radar is the complement</w:t>
+            </w:r>
+          </w:p>
+        </w:tc>
+        <w:tc>
+          <w:tcPr>
+            <w:tcW w:type="dxa" w:w="1600"/>
+            <w:tcBorders>
+              <w:top w:val="single" w:color="BFBFBF" w:sz="4"/>
+              <w:left w:val="single" w:color="BFBFBF" w:sz="4"/>
+              <w:bottom w:val="single" w:color="BFBFBF" w:sz="4"/>
+              <w:right w:val="single" w:color="BFBFBF" w:sz="4"/>
+            </w:tcBorders>
+            <w:tcMar>
+              <w:top w:type="dxa" w:w="60"/>
+              <w:left w:type="dxa" w:w="100"/>
+              <w:bottom w:type="dxa" w:w="60"/>
+              <w:right w:type="dxa" w:w="100"/>
+            </w:tcMar>
+          </w:tcPr>
+          <w:p>
+            <w:r>
+              <w:rPr>
+                <w:b w:val="false"/>
+                <w:bCs w:val="false"/>
+                <w:sz w:val="18"/>
+                <w:szCs w:val="18"/>
+              </w:rPr>
+              <w:t xml:space="preserve">Agrees</w:t>
+            </w:r>
+          </w:p>
+        </w:tc>
+      </w:tr>
+      <w:tr>
+        <w:tc>
+          <w:tcPr>
+            <w:tcW w:type="dxa" w:w="3000"/>
+            <w:tcBorders>
+              <w:top w:val="single" w:color="BFBFBF" w:sz="4"/>
+              <w:left w:val="single" w:color="BFBFBF" w:sz="4"/>
+              <w:bottom w:val="single" w:color="BFBFBF" w:sz="4"/>
+              <w:right w:val="single" w:color="BFBFBF" w:sz="4"/>
+            </w:tcBorders>
+            <w:tcMar>
+              <w:top w:type="dxa" w:w="60"/>
+              <w:left w:type="dxa" w:w="100"/>
+              <w:bottom w:type="dxa" w:w="60"/>
+              <w:right w:type="dxa" w:w="100"/>
+            </w:tcMar>
+          </w:tcPr>
+          <w:p>
+            <w:r>
+              <w:rPr>
+                <w:b w:val="false"/>
+                <w:bCs w:val="false"/>
+                <w:sz w:val="18"/>
+                <w:szCs w:val="18"/>
+              </w:rPr>
+              <w:t xml:space="preserve">No model can test detection at 200–400 m</w:t>
+            </w:r>
+          </w:p>
+        </w:tc>
+        <w:tc>
+          <w:tcPr>
+            <w:tcW w:type="dxa" w:w="4426"/>
+            <w:tcBorders>
+              <w:top w:val="single" w:color="BFBFBF" w:sz="4"/>
+              <w:left w:val="single" w:color="BFBFBF" w:sz="4"/>
+              <w:bottom w:val="single" w:color="BFBFBF" w:sz="4"/>
+              <w:right w:val="single" w:color="BFBFBF" w:sz="4"/>
+            </w:tcBorders>
+            <w:tcMar>
+              <w:top w:type="dxa" w:w="60"/>
+              <w:left w:type="dxa" w:w="100"/>
+              <w:bottom w:type="dxa" w:w="60"/>
+              <w:right w:type="dxa" w:w="100"/>
+            </w:tcMar>
+          </w:tcPr>
+          <w:p>
+            <w:r>
+              <w:rPr>
+                <w:b w:val="false"/>
+                <w:bCs w:val="false"/>
+                <w:sz w:val="18"/>
+                <w:szCs w:val="18"/>
+              </w:rPr>
+              <w:t xml:space="preserve">Torc's own TruckDrive paper: current models “do not generalize to ranges beyond 150 meters”</w:t>
+            </w:r>
+          </w:p>
+        </w:tc>
+        <w:tc>
+          <w:tcPr>
+            <w:tcW w:type="dxa" w:w="1600"/>
+            <w:tcBorders>
+              <w:top w:val="single" w:color="BFBFBF" w:sz="4"/>
+              <w:left w:val="single" w:color="BFBFBF" w:sz="4"/>
+              <w:bottom w:val="single" w:color="BFBFBF" w:sz="4"/>
+              <w:right w:val="single" w:color="BFBFBF" w:sz="4"/>
+            </w:tcBorders>
+            <w:tcMar>
+              <w:top w:type="dxa" w:w="60"/>
+              <w:left w:type="dxa" w:w="100"/>
+              <w:bottom w:type="dxa" w:w="60"/>
+              <w:right w:type="dxa" w:w="100"/>
+            </w:tcMar>
+          </w:tcPr>
+          <w:p>
+            <w:r>
+              <w:rPr>
+                <w:b w:val="false"/>
+                <w:bCs w:val="false"/>
+                <w:sz w:val="18"/>
+                <w:szCs w:val="18"/>
+              </w:rPr>
+              <w:t xml:space="preserve">Agrees</w:t>
+            </w:r>
+          </w:p>
+        </w:tc>
+      </w:tr>
+      <w:tr>
+        <w:tc>
+          <w:tcPr>
+            <w:tcW w:type="dxa" w:w="3000"/>
+            <w:tcBorders>
+              <w:top w:val="single" w:color="BFBFBF" w:sz="4"/>
+              <w:left w:val="single" w:color="BFBFBF" w:sz="4"/>
+              <w:bottom w:val="single" w:color="BFBFBF" w:sz="4"/>
+              <w:right w:val="single" w:color="BFBFBF" w:sz="4"/>
+            </w:tcBorders>
+            <w:tcMar>
+              <w:top w:type="dxa" w:w="60"/>
+              <w:left w:type="dxa" w:w="100"/>
+              <w:bottom w:type="dxa" w:w="60"/>
+              <w:right w:type="dxa" w:w="100"/>
+            </w:tcMar>
+          </w:tcPr>
+          <w:p>
+            <w:r>
+              <w:rPr>
+                <w:b w:val="false"/>
+                <w:bCs w:val="false"/>
+                <w:sz w:val="18"/>
+                <w:szCs w:val="18"/>
+              </w:rPr>
+              <w:t xml:space="preserve">No radar-first detector exists to benchmark</w:t>
+            </w:r>
+          </w:p>
+        </w:tc>
+        <w:tc>
+          <w:tcPr>
+            <w:tcW w:type="dxa" w:w="4426"/>
+            <w:tcBorders>
+              <w:top w:val="single" w:color="BFBFBF" w:sz="4"/>
+              <w:left w:val="single" w:color="BFBFBF" w:sz="4"/>
+              <w:bottom w:val="single" w:color="BFBFBF" w:sz="4"/>
+              <w:right w:val="single" w:color="BFBFBF" w:sz="4"/>
+            </w:tcBorders>
+            <w:tcMar>
+              <w:top w:type="dxa" w:w="60"/>
+              <w:left w:type="dxa" w:w="100"/>
+              <w:bottom w:type="dxa" w:w="60"/>
+              <w:right w:type="dxa" w:w="100"/>
+            </w:tcMar>
+          </w:tcPr>
+          <w:p>
+            <w:r>
+              <w:rPr>
+                <w:b w:val="false"/>
+                <w:bCs w:val="false"/>
+                <w:sz w:val="18"/>
+                <w:szCs w:val="18"/>
+              </w:rPr>
+              <w:t xml:space="preserve">Every company whose sensors we found fuses LiDAR, radar and cameras; none is radar-first</w:t>
+            </w:r>
+          </w:p>
+        </w:tc>
+        <w:tc>
+          <w:tcPr>
+            <w:tcW w:type="dxa" w:w="1600"/>
+            <w:tcBorders>
+              <w:top w:val="single" w:color="BFBFBF" w:sz="4"/>
+              <w:left w:val="single" w:color="BFBFBF" w:sz="4"/>
+              <w:bottom w:val="single" w:color="BFBFBF" w:sz="4"/>
+              <w:right w:val="single" w:color="BFBFBF" w:sz="4"/>
+            </w:tcBorders>
+            <w:tcMar>
+              <w:top w:type="dxa" w:w="60"/>
+              <w:left w:type="dxa" w:w="100"/>
+              <w:bottom w:type="dxa" w:w="60"/>
+              <w:right w:type="dxa" w:w="100"/>
+            </w:tcMar>
+          </w:tcPr>
+          <w:p>
+            <w:r>
+              <w:rPr>
+                <w:b w:val="false"/>
+                <w:bCs w:val="false"/>
+                <w:sz w:val="18"/>
+                <w:szCs w:val="18"/>
+              </w:rPr>
+              <w:t xml:space="preserve">Agrees</w:t>
+            </w:r>
+          </w:p>
+        </w:tc>
+      </w:tr>
+      <w:tr>
+        <w:tc>
+          <w:tcPr>
+            <w:tcW w:type="dxa" w:w="3000"/>
+            <w:tcBorders>
+              <w:top w:val="single" w:color="BFBFBF" w:sz="4"/>
+              <w:left w:val="single" w:color="BFBFBF" w:sz="4"/>
+              <w:bottom w:val="single" w:color="BFBFBF" w:sz="4"/>
+              <w:right w:val="single" w:color="BFBFBF" w:sz="4"/>
+            </w:tcBorders>
+            <w:tcMar>
+              <w:top w:type="dxa" w:w="60"/>
+              <w:left w:type="dxa" w:w="100"/>
+              <w:bottom w:type="dxa" w:w="60"/>
+              <w:right w:type="dxa" w:w="100"/>
+            </w:tcMar>
+          </w:tcPr>
+          <w:p>
+            <w:r>
+              <w:rPr>
+                <w:b w:val="false"/>
+                <w:bCs w:val="false"/>
+                <w:sz w:val="18"/>
+                <w:szCs w:val="18"/>
+              </w:rPr>
+              <w:t xml:space="preserve">Radar's clear advantage is narrow (fog); LiDAR held up in our rain and snow scenes</w:t>
+            </w:r>
+          </w:p>
+        </w:tc>
+        <w:tc>
+          <w:tcPr>
+            <w:tcW w:type="dxa" w:w="4426"/>
+            <w:tcBorders>
+              <w:top w:val="single" w:color="BFBFBF" w:sz="4"/>
+              <w:left w:val="single" w:color="BFBFBF" w:sz="4"/>
+              <w:bottom w:val="single" w:color="BFBFBF" w:sz="4"/>
+              <w:right w:val="single" w:color="BFBFBF" w:sz="4"/>
+            </w:tcBorders>
+            <w:tcMar>
+              <w:top w:type="dxa" w:w="60"/>
+              <w:left w:type="dxa" w:w="100"/>
+              <w:bottom w:type="dxa" w:w="60"/>
+              <w:right w:type="dxa" w:w="100"/>
+            </w:tcMar>
+          </w:tcPr>
+          <w:p>
+            <w:r>
+              <w:rPr>
+                <w:b w:val="false"/>
+                <w:bCs w:val="false"/>
+                <w:sz w:val="18"/>
+                <w:szCs w:val="18"/>
+              </w:rPr>
+              <w:t xml:space="preserve">Industry treats radar as the bad-weather sensor; weather limited Aurora's driverless operations ~40% of the time in 2025</w:t>
+            </w:r>
+          </w:p>
+        </w:tc>
+        <w:tc>
+          <w:tcPr>
+            <w:tcW w:type="dxa" w:w="1600"/>
+            <w:tcBorders>
+              <w:top w:val="single" w:color="BFBFBF" w:sz="4"/>
+              <w:left w:val="single" w:color="BFBFBF" w:sz="4"/>
+              <w:bottom w:val="single" w:color="BFBFBF" w:sz="4"/>
+              <w:right w:val="single" w:color="BFBFBF" w:sz="4"/>
+            </w:tcBorders>
+            <w:tcMar>
+              <w:top w:type="dxa" w:w="60"/>
+              <w:left w:type="dxa" w:w="100"/>
+              <w:bottom w:type="dxa" w:w="60"/>
+              <w:right w:type="dxa" w:w="100"/>
+            </w:tcMar>
+          </w:tcPr>
+          <w:p>
+            <w:r>
+              <w:rPr>
+                <w:b w:val="false"/>
+                <w:bCs w:val="false"/>
+                <w:sz w:val="18"/>
+                <w:szCs w:val="18"/>
+              </w:rPr>
+              <w:t xml:space="preserve">Tension</w:t>
+            </w:r>
+          </w:p>
+        </w:tc>
+      </w:tr>
+      <w:tr>
+        <w:tc>
+          <w:tcPr>
+            <w:tcW w:type="dxa" w:w="3000"/>
+            <w:tcBorders>
+              <w:top w:val="single" w:color="BFBFBF" w:sz="4"/>
+              <w:left w:val="single" w:color="BFBFBF" w:sz="4"/>
+              <w:bottom w:val="single" w:color="BFBFBF" w:sz="4"/>
+              <w:right w:val="single" w:color="BFBFBF" w:sz="4"/>
+            </w:tcBorders>
+            <w:tcMar>
+              <w:top w:type="dxa" w:w="60"/>
+              <w:left w:type="dxa" w:w="100"/>
+              <w:bottom w:type="dxa" w:w="60"/>
+              <w:right w:type="dxa" w:w="100"/>
+            </w:tcMar>
+          </w:tcPr>
+          <w:p>
+            <w:r>
+              <w:rPr>
+                <w:b w:val="false"/>
+                <w:bCs w:val="false"/>
+                <w:sz w:val="18"/>
+                <w:szCs w:val="18"/>
+              </w:rPr>
+              <w:t xml:space="preserve">Public models don't transfer to a new truck without correcting the sensor frame</w:t>
+            </w:r>
+          </w:p>
+        </w:tc>
+        <w:tc>
+          <w:tcPr>
+            <w:tcW w:type="dxa" w:w="4426"/>
+            <w:tcBorders>
+              <w:top w:val="single" w:color="BFBFBF" w:sz="4"/>
+              <w:left w:val="single" w:color="BFBFBF" w:sz="4"/>
+              <w:bottom w:val="single" w:color="BFBFBF" w:sz="4"/>
+              <w:right w:val="single" w:color="BFBFBF" w:sz="4"/>
+            </w:tcBorders>
+            <w:tcMar>
+              <w:top w:type="dxa" w:w="60"/>
+              <w:left w:type="dxa" w:w="100"/>
+              <w:bottom w:type="dxa" w:w="60"/>
+              <w:right w:type="dxa" w:w="100"/>
+            </w:tcMar>
+          </w:tcPr>
+          <w:p>
+            <w:r>
+              <w:rPr>
+                <w:b w:val="false"/>
+                <w:bCs w:val="false"/>
+                <w:sz w:val="18"/>
+                <w:szCs w:val="18"/>
+              </w:rPr>
+              <w:t xml:space="preserve">Waabi claims its stack moved to a differently-sensored truck with zero retraining (no metrics published)</w:t>
+            </w:r>
+          </w:p>
+        </w:tc>
+        <w:tc>
+          <w:tcPr>
+            <w:tcW w:type="dxa" w:w="1600"/>
+            <w:tcBorders>
+              <w:top w:val="single" w:color="BFBFBF" w:sz="4"/>
+              <w:left w:val="single" w:color="BFBFBF" w:sz="4"/>
+              <w:bottom w:val="single" w:color="BFBFBF" w:sz="4"/>
+              <w:right w:val="single" w:color="BFBFBF" w:sz="4"/>
+            </w:tcBorders>
+            <w:tcMar>
+              <w:top w:type="dxa" w:w="60"/>
+              <w:left w:type="dxa" w:w="100"/>
+              <w:bottom w:type="dxa" w:w="60"/>
+              <w:right w:type="dxa" w:w="100"/>
+            </w:tcMar>
+          </w:tcPr>
+          <w:p>
+            <w:r>
+              <w:rPr>
+                <w:b w:val="false"/>
+                <w:bCs w:val="false"/>
+                <w:sz w:val="18"/>
+                <w:szCs w:val="18"/>
+              </w:rPr>
+              <w:t xml:space="preserve">Tension</w:t>
+            </w:r>
+          </w:p>
+        </w:tc>
+      </w:tr>
+    </w:tbl>
+    <w:p>
+      <w:pPr>
+        <w:spacing w:after="120" w:before="120"/>
+      </w:pPr>
+      <w:r>
+        <w:t xml:space="preserve">Our long-range result agrees with industry's sensor choices and with Torc's own research. The two tensions, whether radar really covers bad weather and whether models can move between trucks, are the most useful open questions to put to the client.</w:t>
+      </w:r>
+    </w:p>
+    <w:p>
+      <w:pPr>
+        <w:spacing w:after="240" w:before="120"/>
+      </w:pPr>
+      <w:r>
+        <w:rPr>
+          <w:b/>
+          <w:bCs/>
+        </w:rPr>
+        <w:t xml:space="preserve">Source: </w:t>
+      </w:r>
+      <w:hyperlink w:history="1" r:id="rIdAidenAd3doc">
+        <w:r>
+          <w:rPr>
+            <w:rStyle w:val="Hyperlink"/>
+          </w:rPr>
+          <w:t xml:space="preserve">ad-3-industry-check.md</w:t>
+        </w:r>
+      </w:hyperlink>
+      <w:r>
+        <w:t xml:space="preserve"> · </w:t>
+      </w:r>
+      <w:hyperlink w:history="1" r:id="rIdAidenLedger">
+        <w:r>
+          <w:rPr>
+            <w:rStyle w:val="Hyperlink"/>
+          </w:rPr>
+          <w:t xml:space="preserve">domain-study/README.md (ledger rows 8–13)</w:t>
         </w:r>
       </w:hyperlink>
     </w:p>

</xml_diff>

<commit_message>
Report: LiDAR row quotes the best single channel (mAP 0.0555) from PR #63's channel comparison
Co-Authored-By: Claude Opus 5.5 <noreply@anthropic.com>
</commit_message>
<xml_diff>
--- a/evidence/Report_Final_Final_v2.docx
+++ b/evidence/Report_Final_Final_v2.docx
@@ -2744,7 +2744,7 @@
                 <w:sz w:val="18"/>
                 <w:szCs w:val="18"/>
               </w:rPr>
-              <w:t xml:space="preserve">Near zero</w:t>
+              <w:t xml:space="preserve">Low</w:t>
             </w:r>
           </w:p>
         </w:tc>
@@ -2772,7 +2772,7 @@
                 <w:sz w:val="18"/>
                 <w:szCs w:val="18"/>
               </w:rPr>
-              <w:t xml:space="preserve">mAP 0.0067 after rotating the tilted blind-spot LiDAR upright (0.0000 unrotated; pending PR #63 review). One short-range channel: only 23.9% of scored boxes contain any of its points</w:t>
+              <w:t xml:space="preserve">mAP 0.0555 on the best single LiDAR (side-mounted, reaches 70% of scored objects; car AP 0.20), with the input rotated upright. 0.0067 on the tilted blind-spot LiDAR first used, which reaches 24%. Pending PR #63 review</w:t>
             </w:r>
           </w:p>
         </w:tc>

</xml_diff>

<commit_message>
Report: state final findings only; remove earlier-run and revision wording
Co-Authored-By: Claude Opus 5.5 <noreply@anthropic.com>
</commit_message>
<xml_diff>
--- a/evidence/Report_Final_Final_v2.docx
+++ b/evidence/Report_Final_Final_v2.docx
@@ -49,10 +49,10 @@
           <w:b/>
           <w:bCs/>
         </w:rPr>
-        <w:t xml:space="preserve">Revised: </w:t>
-      </w:r>
-      <w:r>
-        <w:t xml:space="preserve">30 September 2026 (v2, review corrections applied)</w:t>
+        <w:t xml:space="preserve">Date: </w:t>
+      </w:r>
+      <w:r>
+        <w:t xml:space="preserve">30 September 2026</w:t>
       </w:r>
     </w:p>
     <w:p>
@@ -877,7 +877,7 @@
         <w:t xml:space="preserve">Limitation: </w:t>
       </w:r>
       <w:r>
-        <w:t xml:space="preserve">Four-camera mAP is 0.0046, almost all of it traffic cones (18.54% AP at the 4 m threshold). The one-camera run (EXP-0006) scored 0.0000. The 0.5–4 m axis is the matching tolerance between predicted and true box centres, not distance from the truck. Cause not isolated: camera height/pitch vs the logistics-yard domain. Camera-only, so it cannot support a radar-vs-LiDAR comparison.</w:t>
+        <w:t xml:space="preserve">Four-camera mAP is 0.0046, almost all of it traffic cones (18.54% AP at the 4 m threshold). The 0.5–4 m axis is the matching tolerance between predicted and true box centres, not distance from the truck. Cause not isolated: camera height/pitch vs the logistics-yard domain. Camera-only, so it cannot support a radar-vs-LiDAR comparison.</w:t>
       </w:r>
     </w:p>
     <w:p>
@@ -885,7 +885,7 @@
         <w:spacing w:after="120" w:before="120"/>
       </w:pPr>
       <w:r>
-        <w:t xml:space="preserve">A general-purpose 3D detector does not transfer to TruckScenes out of the box. Adding cameras moves the score from zero to barely above zero, and only for one class.</w:t>
+        <w:t xml:space="preserve">A general-purpose 3D detector does not transfer to TruckScenes out of the box: the score is barely above zero, and only for one class.</w:t>
       </w:r>
     </w:p>
     <w:p>
@@ -916,17 +916,6 @@
             <w:rStyle w:val="Hyperlink"/>
           </w:rPr>
           <w:t xml:space="preserve">EXP-0010</w:t>
-        </w:r>
-      </w:hyperlink>
-      <w:r>
-        <w:t xml:space="preserve"> · </w:t>
-      </w:r>
-      <w:hyperlink w:history="1" r:id="rIdba4jqhwkvo4etobemcbef">
-        <w:r>
-          <w:rPr>
-            <w:rStyle w:val="Hyperlink"/>
-          </w:rPr>
-          <w:t xml:space="preserve">EXP-0006</w:t>
         </w:r>
       </w:hyperlink>
     </w:p>
@@ -1081,7 +1070,7 @@
         <w:t xml:space="preserve">Limitation: </w:t>
       </w:r>
       <w:r>
-        <w:t xml:space="preserve">Geometric support only, not detection accuracy. Labels were drawn from LiDAR, which favours LiDAR. Observations repeat across frames. This per-point version (record 0016) replaces the earlier rigid run of 399 samples.</w:t>
+        <w:t xml:space="preserve">Geometric support only, not detection accuracy. Labels were drawn from LiDAR, which favours LiDAR. Observations repeat across frames.</w:t>
       </w:r>
     </w:p>
     <w:p>
@@ -2772,7 +2761,7 @@
                 <w:sz w:val="18"/>
                 <w:szCs w:val="18"/>
               </w:rPr>
-              <w:t xml:space="preserve">mAP 0.1005 with all six LiDARs combined and the input rotated upright (95% of scored objects visible; car AP 0.41). Trucks score near zero despite being fully visible, so the model does not recognise heavy trucks. Single LiDARs: 0.0057–0.0555. Pending PR #63 review</w:t>
+              <w:t xml:space="preserve">mAP 0.1005 with all six LiDARs combined, input aligned upright to match the model (95% of scored objects visible; car AP 0.41). Trucks score near zero despite being fully visible, so the model does not recognise heavy trucks</w:t>
             </w:r>
           </w:p>
         </w:tc>
@@ -2858,7 +2847,7 @@
                 <w:sz w:val="18"/>
                 <w:szCs w:val="18"/>
               </w:rPr>
-              <w:t xml:space="preserve">mAP 0.0000 (1 camera), 0.0046 (4 cameras), zero-shot</w:t>
+              <w:t xml:space="preserve">mAP 0.0046 (4 cameras), zero-shot</w:t>
             </w:r>
           </w:p>
         </w:tc>

</xml_diff>